<commit_message>
Add water dispenser/cooler Legionella and biofilm risk check
Reservoir-type coolers are a named Legionella/biofilm risk under
HSG274/ACOP L8 (stored water, biofilm-prone internals), distinct from a
mains-fed/point-of-use unit's continuous-flow lower risk. Was in the
original audit's search scope but never surfaced in the prioritized
findings list - found on a direct re-check rather than assumed complete.

Co-Authored-By: Claude Sonnet 5 <noreply@anthropic.com>
Claude-Session: https://claude.ai/code/session_01F6ENyq5jsYnuqv2xmyeFr3
</commit_message>
<xml_diff>
--- a/Document_Outlines/Input data - systems/Domestic hot and cold water systems_V2.0.docx
+++ b/Document_Outlines/Input data - systems/Domestic hot and cold water systems_V2.0.docx
@@ -2357,6 +2357,45 @@
           <w:p>
             <w:r>
               <w:t>ISO 23500</w:t>
+            </w:r>
+          </w:p>
+        </w:tc>
+      </w:tr>
+      <w:tr>
+        <w:trPr>
+          <w:tblCellSpacing w:w="15" w:type="dxa"/>
+        </w:trPr>
+        <w:tc>
+          <w:tcPr>
+            <w:tcW w:w="0" w:type="auto"/>
+            <w:vAlign w:val="center"/>
+            <w:hideMark/>
+          </w:tcPr>
+          <w:p>
+            <w:r>
+              <w:t>Water dispenser/cooler Legionella and biofilm risk confirmed (reservoir-type vs mains-fed/point-of-use)</w:t>
+            </w:r>
+          </w:p>
+        </w:tc>
+        <w:tc>
+          <w:tcPr>
+            <w:tcW w:w="0" w:type="auto"/>
+            <w:vAlign w:val="center"/>
+            <w:hideMark/>
+          </w:tcPr>
+          <w:p>
+            <w:r/>
+          </w:p>
+        </w:tc>
+        <w:tc>
+          <w:tcPr>
+            <w:tcW w:w="0" w:type="auto"/>
+            <w:vAlign w:val="center"/>
+            <w:hideMark/>
+          </w:tcPr>
+          <w:p>
+            <w:r>
+              <w:t>HSG274 / HSE ACOP L8</w:t>
             </w:r>
           </w:p>
         </w:tc>

</xml_diff>